<commit_message>
docs: include formal figures and revised methods table
</commit_message>
<xml_diff>
--- a/LA_Grid_Manuscript_Resubmission_Rebuild.docx
+++ b/LA_Grid_Manuscript_Resubmission_Rebuild.docx
@@ -157,6 +157,319 @@
         <w:t>The frozen evaluation contains 1,000 physical realizations for each of four hazards, each with one unconstrained and eight scheduled baseline trajectories, for 36,000 baseline trajectories. The 2pc50 one-factor-at-a-time resource study reuses the same 1,000 samples with C29, C86, C114, and repair-duration scales 0.75, 1.25, and 1.5; C57 and scale 1 are baseline. This adds 48,000 scheduled trajectories. The reviewer-directed vulnerability-first amendment adds 4,000 baseline and 6,000 resource trajectories on the same physical samples, without changing the original 84,000. The common 480 h event horizon covers the frozen schedules. M0/M1 mapping and G0/G1/G2/G3 gate contrasts are offline evaluations of saved station states: G0=e=f, production G1 uses threshold 0.5 and 14 sources, G2 uses 0.05, and G3 uses 0.75. The SCE candidate-supported mapping is restricted to its validation subset. No contrast resamples damage or reoptimizes priority.</w:t>
       </w:r>
     </w:p>
+    <w:p>
+      <w:r>
+        <w:br w:type="page"/>
+      </w:r>
+    </w:p>
+    <w:tbl>
+      <w:tblPr>
+        <w:tblStyle w:val="TableGrid"/>
+        <w:tblW w:type="auto" w:w="0"/>
+        <w:jc w:val="center"/>
+        <w:tblLook w:firstColumn="1" w:firstRow="1" w:lastColumn="0" w:lastRow="0" w:noHBand="0" w:noVBand="1" w:val="04A0"/>
+      </w:tblPr>
+      <w:tblGrid>
+        <w:gridCol w:w="2448"/>
+        <w:gridCol w:w="2448"/>
+        <w:gridCol w:w="2448"/>
+        <w:gridCol w:w="2448"/>
+      </w:tblGrid>
+      <w:tr>
+        <w:tc>
+          <w:tcPr>
+            <w:tcW w:type="dxa" w:w="2448"/>
+          </w:tcPr>
+          <w:p>
+            <w:r>
+              <w:t>Module</w:t>
+            </w:r>
+          </w:p>
+        </w:tc>
+        <w:tc>
+          <w:tcPr>
+            <w:tcW w:type="dxa" w:w="2448"/>
+          </w:tcPr>
+          <w:p>
+            <w:r>
+              <w:t>Revision baseline</w:t>
+            </w:r>
+          </w:p>
+        </w:tc>
+        <w:tc>
+          <w:tcPr>
+            <w:tcW w:type="dxa" w:w="2448"/>
+          </w:tcPr>
+          <w:p>
+            <w:r>
+              <w:t>Predeclared contrast</w:t>
+            </w:r>
+          </w:p>
+        </w:tc>
+        <w:tc>
+          <w:tcPr>
+            <w:tcW w:type="dxa" w:w="2448"/>
+          </w:tcPr>
+          <w:p>
+            <w:r>
+              <w:t>Interpretation</w:t>
+            </w:r>
+          </w:p>
+        </w:tc>
+      </w:tr>
+      <w:tr>
+        <w:tc>
+          <w:tcPr>
+            <w:tcW w:type="dxa" w:w="2448"/>
+          </w:tcPr>
+          <w:p>
+            <w:r>
+              <w:t>Network and sources</w:t>
+            </w:r>
+          </w:p>
+        </w:tc>
+        <w:tc>
+          <w:tcPr>
+            <w:tcW w:type="dxa" w:w="2448"/>
+          </w:tcPr>
+          <w:p>
+            <w:r>
+              <w:t>92 stations; 318 edges; 14 Core sources</w:t>
+            </w:r>
+          </w:p>
+        </w:tc>
+        <w:tc>
+          <w:tcPr>
+            <w:tcW w:type="dxa" w:w="2448"/>
+          </w:tcPr>
+          <w:p>
+            <w:r>
+              <w:t>No alternate topology</w:t>
+            </w:r>
+          </w:p>
+        </w:tc>
+        <w:tc>
+          <w:tcPr>
+            <w:tcW w:type="dxa" w:w="2448"/>
+          </w:tcPr>
+          <w:p>
+            <w:r>
+              <w:t>Abstracted source connectivity, not power flow</w:t>
+            </w:r>
+          </w:p>
+        </w:tc>
+      </w:tr>
+      <w:tr>
+        <w:tc>
+          <w:tcPr>
+            <w:tcW w:type="dxa" w:w="2448"/>
+          </w:tcPr>
+          <w:p>
+            <w:r>
+              <w:t>Hazard and physical uncertainty</w:t>
+            </w:r>
+          </w:p>
+        </w:tc>
+        <w:tc>
+          <w:tcPr>
+            <w:tcW w:type="dxa" w:w="2448"/>
+          </w:tcPr>
+          <w:p>
+            <w:r>
+              <w:t>Northridge, San Fernando, Long Beach, 2pc50; 1,000 evaluation draws each</w:t>
+            </w:r>
+          </w:p>
+        </w:tc>
+        <w:tc>
+          <w:tcPr>
+            <w:tcW w:type="dxa" w:w="2448"/>
+          </w:tcPr>
+          <w:p>
+            <w:r>
+              <w:t>64 disjoint 2pc50 planning draws</w:t>
+            </w:r>
+          </w:p>
+        </w:tc>
+        <w:tc>
+          <w:tcPr>
+            <w:tcW w:type="dxa" w:w="2448"/>
+          </w:tcPr>
+          <w:p>
+            <w:r>
+              <w:t>DS and positive duration shared across strategies</w:t>
+            </w:r>
+          </w:p>
+        </w:tc>
+      </w:tr>
+      <w:tr>
+        <w:tc>
+          <w:tcPr>
+            <w:tcW w:type="dxa" w:w="2448"/>
+          </w:tcPr>
+          <w:p>
+            <w:r>
+              <w:t>Mapping</w:t>
+            </w:r>
+          </w:p>
+        </w:tc>
+        <w:tc>
+          <w:tcPr>
+            <w:tcW w:type="dxa" w:w="2448"/>
+          </w:tcPr>
+          <w:p>
+            <w:r>
+              <w:t>M1 utility-compatible inverse-square, 3% cutoff</w:t>
+            </w:r>
+          </w:p>
+        </w:tc>
+        <w:tc>
+          <w:tcPr>
+            <w:tcW w:type="dxa" w:w="2448"/>
+          </w:tcPr>
+          <w:p>
+            <w:r>
+              <w:t>July M0; 1%/no cutoff; SCE supported subset</w:t>
+            </w:r>
+          </w:p>
+        </w:tc>
+        <w:tc>
+          <w:tcPr>
+            <w:tcW w:type="dxa" w:w="2448"/>
+          </w:tcPr>
+          <w:p>
+            <w:r>
+              <w:t>Candidate dependency proxy</w:t>
+            </w:r>
+          </w:p>
+        </w:tc>
+      </w:tr>
+      <w:tr>
+        <w:tc>
+          <w:tcPr>
+            <w:tcW w:type="dxa" w:w="2448"/>
+          </w:tcPr>
+          <w:p>
+            <w:r>
+              <w:t>Gate</w:t>
+            </w:r>
+          </w:p>
+        </w:tc>
+        <w:tc>
+          <w:tcPr>
+            <w:tcW w:type="dxa" w:w="2448"/>
+          </w:tcPr>
+          <w:p>
+            <w:r>
+              <w:t>Raw functionality × threshold 0.5 × source connectivity</w:t>
+            </w:r>
+          </w:p>
+        </w:tc>
+        <w:tc>
+          <w:tcPr>
+            <w:tcW w:type="dxa" w:w="2448"/>
+          </w:tcPr>
+          <w:p>
+            <w:r>
+              <w:t>Ungated; thresholds 0.05 and 0.75</w:t>
+            </w:r>
+          </w:p>
+        </w:tc>
+        <w:tc>
+          <w:tcPr>
+            <w:tcW w:type="dxa" w:w="2448"/>
+          </w:tcPr>
+          <w:p>
+            <w:r>
+              <w:t>Availability proxy and loss decomposition</w:t>
+            </w:r>
+          </w:p>
+        </w:tc>
+      </w:tr>
+      <w:tr>
+        <w:tc>
+          <w:tcPr>
+            <w:tcW w:type="dxa" w:w="2448"/>
+          </w:tcPr>
+          <w:p>
+            <w:r>
+              <w:t>Logistics</w:t>
+            </w:r>
+          </w:p>
+        </w:tc>
+        <w:tc>
+          <w:tcPr>
+            <w:tcW w:type="dxa" w:w="2448"/>
+          </w:tcPr>
+          <w:p>
+            <w:r>
+              <w:t>C57 pooled crews; directed road time</w:t>
+            </w:r>
+          </w:p>
+        </w:tc>
+        <w:tc>
+          <w:tcPr>
+            <w:tcW w:type="dxa" w:w="2448"/>
+          </w:tcPr>
+          <w:p>
+            <w:r>
+              <w:t>C29, C86, C114; duration ×0.75/1.25/1.5</w:t>
+            </w:r>
+          </w:p>
+        </w:tc>
+        <w:tc>
+          <w:tcPr>
+            <w:tcW w:type="dxa" w:w="2448"/>
+          </w:tcPr>
+          <w:p>
+            <w:r>
+              <w:t>One-factor-at-a-time, 2pc50 only</w:t>
+            </w:r>
+          </w:p>
+        </w:tc>
+      </w:tr>
+      <w:tr>
+        <w:tc>
+          <w:tcPr>
+            <w:tcW w:type="dxa" w:w="2448"/>
+          </w:tcPr>
+          <w:p>
+            <w:r>
+              <w:t>Optimization</w:t>
+            </w:r>
+          </w:p>
+        </w:tc>
+        <w:tc>
+          <w:tcPr>
+            <w:tcW w:type="dxa" w:w="2448"/>
+          </w:tcPr>
+          <w:p>
+            <w:r>
+              <w:t>Direct mean community burden; 5 seeds; 100 × 100 budget</w:t>
+            </w:r>
+          </w:p>
+        </w:tc>
+        <w:tc>
+          <w:tcPr>
+            <w:tcW w:type="dxa" w:w="2448"/>
+          </w:tcPr>
+          <w:p>
+            <w:r>
+              <w:t>Seven deterministic incumbents</w:t>
+            </w:r>
+          </w:p>
+        </w:tc>
+        <w:tc>
+          <w:tcPr>
+            <w:tcW w:type="dxa" w:w="2448"/>
+          </w:tcPr>
+          <w:p>
+            <w:r>
+              <w:t>Impact-first retained; no search improvement</w:t>
+            </w:r>
+          </w:p>
+        </w:tc>
+      </w:tr>
+    </w:tbl>
     <w:p>
       <w:pPr>
         <w:pStyle w:val="Heading1"/>
@@ -1311,8 +1624,285 @@
         <w:t>Xu, N., Guikema, S. D., Davidson, R. A., Nozick, L. K., Çağnan, Z., &amp; Vaziri, K. (2007). Optimizing scheduling of post-earthquake electric power restoration tasks. Earthquake Engineering &amp; Structural Dynamics, 36(3), 265-284. https://doi.org/10.1002/eqe.623</w:t>
       </w:r>
     </w:p>
+    <w:p>
+      <w:r>
+        <w:br w:type="page"/>
+      </w:r>
+    </w:p>
+    <w:p>
+      <w:pPr>
+        <w:pStyle w:val="Heading1"/>
+      </w:pPr>
+      <w:r>
+        <w:t>Figures</w:t>
+      </w:r>
+    </w:p>
+    <w:p>
+      <w:r>
+        <w:drawing>
+          <wp:inline xmlns:a="http://schemas.openxmlformats.org/drawingml/2006/main" xmlns:pic="http://schemas.openxmlformats.org/drawingml/2006/picture">
+            <wp:extent cx="6035040" cy="3394710"/>
+            <wp:docPr id="1" name="Picture 1"/>
+            <wp:cNvGraphicFramePr>
+              <a:graphicFrameLocks noChangeAspect="1"/>
+            </wp:cNvGraphicFramePr>
+            <a:graphic>
+              <a:graphicData uri="http://schemas.openxmlformats.org/drawingml/2006/picture">
+                <pic:pic>
+                  <pic:nvPicPr>
+                    <pic:cNvPr id="0" name="formal_2pc50_recovery_curves.png"/>
+                    <pic:cNvPicPr/>
+                  </pic:nvPicPr>
+                  <pic:blipFill>
+                    <a:blip r:embed="rId9"/>
+                    <a:stretch>
+                      <a:fillRect/>
+                    </a:stretch>
+                  </pic:blipFill>
+                  <pic:spPr>
+                    <a:xfrm>
+                      <a:off x="0" y="0"/>
+                      <a:ext cx="6035040" cy="3394710"/>
+                    </a:xfrm>
+                    <a:prstGeom prst="rect"/>
+                  </pic:spPr>
+                </pic:pic>
+              </a:graphicData>
+            </a:graphic>
+          </wp:inline>
+        </w:drawing>
+      </w:r>
+    </w:p>
+    <w:p>
+      <w:pPr>
+        <w:jc w:val="center"/>
+      </w:pPr>
+      <w:r>
+        <w:t>Figure 1. Modeled 2pc50 population availability trajectories under retained restoration sequences. Formal 1,000-realization output.</w:t>
+      </w:r>
+    </w:p>
+    <w:p>
+      <w:r>
+        <w:drawing>
+          <wp:inline xmlns:a="http://schemas.openxmlformats.org/drawingml/2006/main" xmlns:pic="http://schemas.openxmlformats.org/drawingml/2006/picture">
+            <wp:extent cx="6035040" cy="4693920"/>
+            <wp:docPr id="2" name="Picture 2"/>
+            <wp:cNvGraphicFramePr>
+              <a:graphicFrameLocks noChangeAspect="1"/>
+            </wp:cNvGraphicFramePr>
+            <a:graphic>
+              <a:graphicData uri="http://schemas.openxmlformats.org/drawingml/2006/picture">
+                <pic:pic>
+                  <pic:nvPicPr>
+                    <pic:cNvPr id="0" name="formal_2pc50_tract_T80_map.png"/>
+                    <pic:cNvPicPr/>
+                  </pic:nvPicPr>
+                  <pic:blipFill>
+                    <a:blip r:embed="rId10"/>
+                    <a:stretch>
+                      <a:fillRect/>
+                    </a:stretch>
+                  </pic:blipFill>
+                  <pic:spPr>
+                    <a:xfrm>
+                      <a:off x="0" y="0"/>
+                      <a:ext cx="6035040" cy="4693920"/>
+                    </a:xfrm>
+                    <a:prstGeom prst="rect"/>
+                  </pic:spPr>
+                </pic:pic>
+              </a:graphicData>
+            </a:graphic>
+          </wp:inline>
+        </w:drawing>
+      </w:r>
+    </w:p>
+    <w:p>
+      <w:pPr>
+        <w:jc w:val="center"/>
+      </w:pPr>
+      <w:r>
+        <w:t>Figure 2. Spatial variation in modeled tract T80 for the formal 2pc50 analysis. Values are service-availability proxy crossings.</w:t>
+      </w:r>
+    </w:p>
+    <w:p>
+      <w:r>
+        <w:drawing>
+          <wp:inline xmlns:a="http://schemas.openxmlformats.org/drawingml/2006/main" xmlns:pic="http://schemas.openxmlformats.org/drawingml/2006/picture">
+            <wp:extent cx="6035040" cy="4395992"/>
+            <wp:docPr id="3" name="Picture 3"/>
+            <wp:cNvGraphicFramePr>
+              <a:graphicFrameLocks noChangeAspect="1"/>
+            </wp:cNvGraphicFramePr>
+            <a:graphic>
+              <a:graphicData uri="http://schemas.openxmlformats.org/drawingml/2006/picture">
+                <pic:pic>
+                  <pic:nvPicPr>
+                    <pic:cNvPr id="0" name="FIGURE_A_EQUITY_EFFICIENCY.png"/>
+                    <pic:cNvPicPr/>
+                  </pic:nvPicPr>
+                  <pic:blipFill>
+                    <a:blip r:embed="rId11"/>
+                    <a:stretch>
+                      <a:fillRect/>
+                    </a:stretch>
+                  </pic:blipFill>
+                  <pic:spPr>
+                    <a:xfrm>
+                      <a:off x="0" y="0"/>
+                      <a:ext cx="6035040" cy="4395992"/>
+                    </a:xfrm>
+                    <a:prstGeom prst="rect"/>
+                  </pic:spPr>
+                </pic:pic>
+              </a:graphicData>
+            </a:graphic>
+          </wp:inline>
+        </w:drawing>
+      </w:r>
+    </w:p>
+    <w:p>
+      <w:pPr>
+        <w:jc w:val="center"/>
+      </w:pPr>
+      <w:r>
+        <w:t>Figure 3. Aggregate population burden versus Q4 absolute burden across hazards and selected strategies.</w:t>
+      </w:r>
+    </w:p>
+    <w:p>
+      <w:r>
+        <w:drawing>
+          <wp:inline xmlns:a="http://schemas.openxmlformats.org/drawingml/2006/main" xmlns:pic="http://schemas.openxmlformats.org/drawingml/2006/picture">
+            <wp:extent cx="6035040" cy="3386156"/>
+            <wp:docPr id="4" name="Picture 4"/>
+            <wp:cNvGraphicFramePr>
+              <a:graphicFrameLocks noChangeAspect="1"/>
+            </wp:cNvGraphicFramePr>
+            <a:graphic>
+              <a:graphicData uri="http://schemas.openxmlformats.org/drawingml/2006/picture">
+                <pic:pic>
+                  <pic:nvPicPr>
+                    <pic:cNvPr id="0" name="FIGURE_B_QUARTILE_ABSOLUTE_BURDEN.png"/>
+                    <pic:cNvPicPr/>
+                  </pic:nvPicPr>
+                  <pic:blipFill>
+                    <a:blip r:embed="rId12"/>
+                    <a:stretch>
+                      <a:fillRect/>
+                    </a:stretch>
+                  </pic:blipFill>
+                  <pic:spPr>
+                    <a:xfrm>
+                      <a:off x="0" y="0"/>
+                      <a:ext cx="6035040" cy="3386156"/>
+                    </a:xfrm>
+                    <a:prstGeom prst="rect"/>
+                  </pic:spPr>
+                </pic:pic>
+              </a:graphicData>
+            </a:graphic>
+          </wp:inline>
+        </w:drawing>
+      </w:r>
+    </w:p>
+    <w:p>
+      <w:pPr>
+        <w:jc w:val="center"/>
+      </w:pPr>
+      <w:r>
+        <w:t>Figure 4. Q1–Q4 absolute modeled burden for 2pc50/C57 with paired-realization uncertainty.</w:t>
+      </w:r>
+    </w:p>
+    <w:p>
+      <w:r>
+        <w:drawing>
+          <wp:inline xmlns:a="http://schemas.openxmlformats.org/drawingml/2006/main" xmlns:pic="http://schemas.openxmlformats.org/drawingml/2006/picture">
+            <wp:extent cx="6035040" cy="3062359"/>
+            <wp:docPr id="5" name="Picture 5"/>
+            <wp:cNvGraphicFramePr>
+              <a:graphicFrameLocks noChangeAspect="1"/>
+            </wp:cNvGraphicFramePr>
+            <a:graphic>
+              <a:graphicData uri="http://schemas.openxmlformats.org/drawingml/2006/picture">
+                <pic:pic>
+                  <pic:nvPicPr>
+                    <pic:cNvPr id="0" name="FIGURE_C_TRACT_EFFECT_MAP.png"/>
+                    <pic:cNvPicPr/>
+                  </pic:nvPicPr>
+                  <pic:blipFill>
+                    <a:blip r:embed="rId13"/>
+                    <a:stretch>
+                      <a:fillRect/>
+                    </a:stretch>
+                  </pic:blipFill>
+                  <pic:spPr>
+                    <a:xfrm>
+                      <a:off x="0" y="0"/>
+                      <a:ext cx="6035040" cy="3062359"/>
+                    </a:xfrm>
+                    <a:prstGeom prst="rect"/>
+                  </pic:spPr>
+                </pic:pic>
+              </a:graphicData>
+            </a:graphic>
+          </wp:inline>
+        </w:drawing>
+      </w:r>
+    </w:p>
+    <w:p>
+      <w:pPr>
+        <w:jc w:val="center"/>
+      </w:pPr>
+      <w:r>
+        <w:t>Figure 5. Paired-mean tract changes under vulnerability-first relative to hospital-first and impact-first.</w:t>
+      </w:r>
+    </w:p>
+    <w:p>
+      <w:r>
+        <w:drawing>
+          <wp:inline xmlns:a="http://schemas.openxmlformats.org/drawingml/2006/main" xmlns:pic="http://schemas.openxmlformats.org/drawingml/2006/picture">
+            <wp:extent cx="6035040" cy="5640427"/>
+            <wp:docPr id="6" name="Picture 6"/>
+            <wp:cNvGraphicFramePr>
+              <a:graphicFrameLocks noChangeAspect="1"/>
+            </wp:cNvGraphicFramePr>
+            <a:graphic>
+              <a:graphicData uri="http://schemas.openxmlformats.org/drawingml/2006/picture">
+                <pic:pic>
+                  <pic:nvPicPr>
+                    <pic:cNvPr id="0" name="FIGURE_D_RESOURCE_EQUITY_SENSITIVITY.png"/>
+                    <pic:cNvPicPr/>
+                  </pic:nvPicPr>
+                  <pic:blipFill>
+                    <a:blip r:embed="rId14"/>
+                    <a:stretch>
+                      <a:fillRect/>
+                    </a:stretch>
+                  </pic:blipFill>
+                  <pic:spPr>
+                    <a:xfrm>
+                      <a:off x="0" y="0"/>
+                      <a:ext cx="6035040" cy="5640427"/>
+                    </a:xfrm>
+                    <a:prstGeom prst="rect"/>
+                  </pic:spPr>
+                </pic:pic>
+              </a:graphicData>
+            </a:graphic>
+          </wp:inline>
+        </w:drawing>
+      </w:r>
+    </w:p>
+    <w:p>
+      <w:pPr>
+        <w:jc w:val="center"/>
+      </w:pPr>
+      <w:r>
+        <w:t>Figure 6. 2pc50 one-factor-at-a-time resource contrasts for population and Q4 burden.</w:t>
+      </w:r>
+    </w:p>
     <w:sectPr>
-      <w:footerReference w:type="default" r:id="rId9"/>
+      <w:footerReference w:type="default" r:id="rId15"/>
       <w:pgSz w:w="12240" w:h="15840"/>
       <w:pgMar w:top="1152" w:right="1224" w:bottom="1152" w:left="1224" w:header="720" w:footer="720" w:gutter="0"/>
       <w:cols w:space="720"/>

</xml_diff>